<commit_message>
docs: informe final completo - 32 diagramas PNG (14 BCE + 14 SSD + 4 extras), DOCX 1.5MB
</commit_message>
<xml_diff>
--- a/docs/INFORME_SISEXP_FINAL.docx
+++ b/docs/INFORME_SISEXP_FINAL.docx
@@ -2406,7 +2406,7 @@
     </w:p>
     <w:bookmarkEnd w:id="20"/>
     <w:bookmarkEnd w:id="21"/>
-    <w:bookmarkStart w:id="94" w:name="metodologia-iconix"/>
+    <w:bookmarkStart w:id="150" w:name="metodologia-iconix"/>
     <w:p>
       <w:pPr>
         <w:pStyle w:val="Heading1"/>
@@ -2664,7 +2664,7 @@
               <w:pStyle w:val="Compact"/>
             </w:pPr>
             <w:r>
-              <w:t xml:space="preserve">4 diagramas SSD</w:t>
+              <w:t xml:space="preserve">14 diagramas SSD</w:t>
             </w:r>
           </w:p>
         </w:tc>
@@ -3453,13 +3453,13 @@
       </w:r>
     </w:p>
     <w:bookmarkEnd w:id="31"/>
-    <w:bookmarkStart w:id="80" w:name="fase-3---robustez-diagramas-bce"/>
+    <w:bookmarkStart w:id="88" w:name="fase-3---robustez-diagramas-bce-14"/>
     <w:p>
       <w:pPr>
         <w:pStyle w:val="Heading2"/>
       </w:pPr>
       <w:r>
-        <w:t xml:space="preserve">Fase 3 - Robustez: Diagramas BCE</w:t>
+        <w:t xml:space="preserve">Fase 3 - Robustez: Diagramas BCE (14)</w:t>
       </w:r>
     </w:p>
     <w:p>
@@ -4154,13 +4154,13 @@
       </w:r>
     </w:p>
     <w:bookmarkEnd w:id="75"/>
-    <w:bookmarkStart w:id="79" w:name="bce-13-rastrear-expediente"/>
+    <w:bookmarkStart w:id="79" w:name="bce-12-gestionar-notificaciones"/>
     <w:p>
       <w:pPr>
         <w:pStyle w:val="Heading3"/>
       </w:pPr>
       <w:r>
-        <w:t xml:space="preserve">BCE-13: Rastrear Expediente</w:t>
+        <w:t xml:space="preserve">BCE-12: Gestionar Notificaciones</w:t>
       </w:r>
     </w:p>
     <w:p>
@@ -4170,20 +4170,77 @@
       <w:r>
         <w:drawing>
           <wp:inline>
-            <wp:extent cx="4025900" cy="11633200"/>
+            <wp:extent cx="4953000" cy="12547600"/>
             <wp:effectExtent b="0" l="0" r="0" t="0"/>
             <wp:docPr descr="" title="" id="77" name="Picture"/>
             <a:graphic>
               <a:graphicData uri="http://schemas.openxmlformats.org/drawingml/2006/picture">
                 <pic:pic>
                   <pic:nvPicPr>
-                    <pic:cNvPr descr="img/BCE-CU13.png" id="78" name="Picture"/>
+                    <pic:cNvPr descr="img/BCE-CU12.png" id="78" name="Picture"/>
                     <pic:cNvPicPr>
                       <a:picLocks noChangeArrowheads="1" noChangeAspect="1"/>
                     </pic:cNvPicPr>
                   </pic:nvPicPr>
                   <pic:blipFill>
                     <a:blip r:embed="rId76"/>
+                    <a:stretch>
+                      <a:fillRect/>
+                    </a:stretch>
+                  </pic:blipFill>
+                  <pic:spPr bwMode="auto">
+                    <a:xfrm>
+                      <a:off x="0" y="0"/>
+                      <a:ext cx="4953000" cy="12547600"/>
+                    </a:xfrm>
+                    <a:prstGeom prst="rect">
+                      <a:avLst/>
+                    </a:prstGeom>
+                    <a:noFill/>
+                    <a:ln w="9525">
+                      <a:noFill/>
+                      <a:headEnd/>
+                      <a:tailEnd/>
+                    </a:ln>
+                  </pic:spPr>
+                </pic:pic>
+              </a:graphicData>
+            </a:graphic>
+          </wp:inline>
+        </w:drawing>
+      </w:r>
+    </w:p>
+    <w:bookmarkEnd w:id="79"/>
+    <w:bookmarkStart w:id="83" w:name="bce-13-rastrear-expediente"/>
+    <w:p>
+      <w:pPr>
+        <w:pStyle w:val="Heading3"/>
+      </w:pPr>
+      <w:r>
+        <w:t xml:space="preserve">BCE-13: Rastrear Expediente</w:t>
+      </w:r>
+    </w:p>
+    <w:p>
+      <w:pPr>
+        <w:pStyle w:val="FirstParagraph"/>
+      </w:pPr>
+      <w:r>
+        <w:drawing>
+          <wp:inline>
+            <wp:extent cx="4025900" cy="11633200"/>
+            <wp:effectExtent b="0" l="0" r="0" t="0"/>
+            <wp:docPr descr="" title="" id="81" name="Picture"/>
+            <a:graphic>
+              <a:graphicData uri="http://schemas.openxmlformats.org/drawingml/2006/picture">
+                <pic:pic>
+                  <pic:nvPicPr>
+                    <pic:cNvPr descr="img/BCE-CU13.png" id="82" name="Picture"/>
+                    <pic:cNvPicPr>
+                      <a:picLocks noChangeArrowheads="1" noChangeAspect="1"/>
+                    </pic:cNvPicPr>
+                  </pic:nvPicPr>
+                  <pic:blipFill>
+                    <a:blip r:embed="rId80"/>
                     <a:stretch>
                       <a:fillRect/>
                     </a:stretch>
@@ -4210,31 +4267,14 @@
         </w:drawing>
       </w:r>
     </w:p>
-    <w:p>
-      <w:r>
-        <w:pict>
-          <v:rect style="width:0;height:1.5pt" o:hralign="center" o:hrstd="t" o:hr="t"/>
-        </w:pict>
-      </w:r>
-    </w:p>
-    <w:bookmarkEnd w:id="79"/>
-    <w:bookmarkEnd w:id="80"/>
-    <w:bookmarkStart w:id="89" w:name="fase-4---secuencias-diagramas-ssd"/>
-    <w:p>
-      <w:pPr>
-        <w:pStyle w:val="Heading2"/>
-      </w:pPr>
-      <w:r>
-        <w:t xml:space="preserve">Fase 4 - Secuencias: Diagramas SSD</w:t>
-      </w:r>
-    </w:p>
-    <w:bookmarkStart w:id="84" w:name="ssd-01-iniciar-sesion"/>
+    <w:bookmarkEnd w:id="83"/>
+    <w:bookmarkStart w:id="87" w:name="bce-14-cerrar-sesion"/>
     <w:p>
       <w:pPr>
         <w:pStyle w:val="Heading3"/>
       </w:pPr>
       <w:r>
-        <w:t xml:space="preserve">SSD-01: Iniciar Sesion</w:t>
+        <w:t xml:space="preserve">BCE-14: Cerrar Sesion</w:t>
       </w:r>
     </w:p>
     <w:p>
@@ -4244,20 +4284,94 @@
       <w:r>
         <w:drawing>
           <wp:inline>
-            <wp:extent cx="5334000" cy="12141284"/>
+            <wp:extent cx="4445000" cy="8407400"/>
             <wp:effectExtent b="0" l="0" r="0" t="0"/>
-            <wp:docPr descr="" title="" id="82" name="Picture"/>
+            <wp:docPr descr="" title="" id="85" name="Picture"/>
             <a:graphic>
               <a:graphicData uri="http://schemas.openxmlformats.org/drawingml/2006/picture">
                 <pic:pic>
                   <pic:nvPicPr>
-                    <pic:cNvPr descr="img/SSD-CU01.png" id="83" name="Picture"/>
+                    <pic:cNvPr descr="img/BCE-CU14.png" id="86" name="Picture"/>
                     <pic:cNvPicPr>
                       <a:picLocks noChangeArrowheads="1" noChangeAspect="1"/>
                     </pic:cNvPicPr>
                   </pic:nvPicPr>
                   <pic:blipFill>
-                    <a:blip r:embed="rId81"/>
+                    <a:blip r:embed="rId84"/>
+                    <a:stretch>
+                      <a:fillRect/>
+                    </a:stretch>
+                  </pic:blipFill>
+                  <pic:spPr bwMode="auto">
+                    <a:xfrm>
+                      <a:off x="0" y="0"/>
+                      <a:ext cx="4445000" cy="8407400"/>
+                    </a:xfrm>
+                    <a:prstGeom prst="rect">
+                      <a:avLst/>
+                    </a:prstGeom>
+                    <a:noFill/>
+                    <a:ln w="9525">
+                      <a:noFill/>
+                      <a:headEnd/>
+                      <a:tailEnd/>
+                    </a:ln>
+                  </pic:spPr>
+                </pic:pic>
+              </a:graphicData>
+            </a:graphic>
+          </wp:inline>
+        </w:drawing>
+      </w:r>
+    </w:p>
+    <w:p>
+      <w:r>
+        <w:pict>
+          <v:rect style="width:0;height:1.5pt" o:hralign="center" o:hrstd="t" o:hr="t"/>
+        </w:pict>
+      </w:r>
+    </w:p>
+    <w:bookmarkEnd w:id="87"/>
+    <w:bookmarkEnd w:id="88"/>
+    <w:bookmarkStart w:id="145" w:name="fase-4---secuencias-diagramas-ssd-14"/>
+    <w:p>
+      <w:pPr>
+        <w:pStyle w:val="Heading2"/>
+      </w:pPr>
+      <w:r>
+        <w:t xml:space="preserve">Fase 4 - Secuencias: Diagramas SSD (14)</w:t>
+      </w:r>
+    </w:p>
+    <w:bookmarkStart w:id="92" w:name="ssd-01-iniciar-sesion"/>
+    <w:p>
+      <w:pPr>
+        <w:pStyle w:val="Heading3"/>
+      </w:pPr>
+      <w:r>
+        <w:t xml:space="preserve">SSD-01: Iniciar Sesion</w:t>
+      </w:r>
+    </w:p>
+    <w:p>
+      <w:pPr>
+        <w:pStyle w:val="FirstParagraph"/>
+      </w:pPr>
+      <w:r>
+        <w:drawing>
+          <wp:inline>
+            <wp:extent cx="5334000" cy="12141284"/>
+            <wp:effectExtent b="0" l="0" r="0" t="0"/>
+            <wp:docPr descr="" title="" id="90" name="Picture"/>
+            <a:graphic>
+              <a:graphicData uri="http://schemas.openxmlformats.org/drawingml/2006/picture">
+                <pic:pic>
+                  <pic:nvPicPr>
+                    <pic:cNvPr descr="img/SSD-CU01.png" id="91" name="Picture"/>
+                    <pic:cNvPicPr>
+                      <a:picLocks noChangeArrowheads="1" noChangeAspect="1"/>
+                    </pic:cNvPicPr>
+                  </pic:nvPicPr>
+                  <pic:blipFill>
+                    <a:blip r:embed="rId89"/>
                     <a:stretch>
                       <a:fillRect/>
                     </a:stretch>
@@ -4284,14 +4398,14 @@
         </w:drawing>
       </w:r>
     </w:p>
-    <w:bookmarkEnd w:id="84"/>
-    <w:bookmarkStart w:id="88" w:name="ssd-04-cambiar-estado-expediente"/>
+    <w:bookmarkEnd w:id="92"/>
+    <w:bookmarkStart w:id="96" w:name="ssd-02-ver-dashboard"/>
     <w:p>
       <w:pPr>
         <w:pStyle w:val="Heading3"/>
       </w:pPr>
       <w:r>
-        <w:t xml:space="preserve">SSD-04: Cambiar Estado Expediente</w:t>
+        <w:t xml:space="preserve">SSD-02: Ver Dashboard</w:t>
       </w:r>
     </w:p>
     <w:p>
@@ -4301,20 +4415,134 @@
       <w:r>
         <w:drawing>
           <wp:inline>
-            <wp:extent cx="5334000" cy="12266839"/>
+            <wp:extent cx="5334000" cy="4848390"/>
             <wp:effectExtent b="0" l="0" r="0" t="0"/>
-            <wp:docPr descr="" title="" id="86" name="Picture"/>
+            <wp:docPr descr="" title="" id="94" name="Picture"/>
             <a:graphic>
               <a:graphicData uri="http://schemas.openxmlformats.org/drawingml/2006/picture">
                 <pic:pic>
                   <pic:nvPicPr>
-                    <pic:cNvPr descr="img/SSD-CU04.png" id="87" name="Picture"/>
+                    <pic:cNvPr descr="img/SSD-CU02.png" id="95" name="Picture"/>
                     <pic:cNvPicPr>
                       <a:picLocks noChangeArrowheads="1" noChangeAspect="1"/>
                     </pic:cNvPicPr>
                   </pic:nvPicPr>
                   <pic:blipFill>
-                    <a:blip r:embed="rId85"/>
+                    <a:blip r:embed="rId93"/>
+                    <a:stretch>
+                      <a:fillRect/>
+                    </a:stretch>
+                  </pic:blipFill>
+                  <pic:spPr bwMode="auto">
+                    <a:xfrm>
+                      <a:off x="0" y="0"/>
+                      <a:ext cx="5334000" cy="4848390"/>
+                    </a:xfrm>
+                    <a:prstGeom prst="rect">
+                      <a:avLst/>
+                    </a:prstGeom>
+                    <a:noFill/>
+                    <a:ln w="9525">
+                      <a:noFill/>
+                      <a:headEnd/>
+                      <a:tailEnd/>
+                    </a:ln>
+                  </pic:spPr>
+                </pic:pic>
+              </a:graphicData>
+            </a:graphic>
+          </wp:inline>
+        </w:drawing>
+      </w:r>
+    </w:p>
+    <w:bookmarkEnd w:id="96"/>
+    <w:bookmarkStart w:id="100" w:name="ssd-03-crear-expediente"/>
+    <w:p>
+      <w:pPr>
+        <w:pStyle w:val="Heading3"/>
+      </w:pPr>
+      <w:r>
+        <w:t xml:space="preserve">SSD-03: Crear Expediente</w:t>
+      </w:r>
+    </w:p>
+    <w:p>
+      <w:pPr>
+        <w:pStyle w:val="FirstParagraph"/>
+      </w:pPr>
+      <w:r>
+        <w:drawing>
+          <wp:inline>
+            <wp:extent cx="5334000" cy="7490732"/>
+            <wp:effectExtent b="0" l="0" r="0" t="0"/>
+            <wp:docPr descr="" title="" id="98" name="Picture"/>
+            <a:graphic>
+              <a:graphicData uri="http://schemas.openxmlformats.org/drawingml/2006/picture">
+                <pic:pic>
+                  <pic:nvPicPr>
+                    <pic:cNvPr descr="img/SSD-CU03.png" id="99" name="Picture"/>
+                    <pic:cNvPicPr>
+                      <a:picLocks noChangeArrowheads="1" noChangeAspect="1"/>
+                    </pic:cNvPicPr>
+                  </pic:nvPicPr>
+                  <pic:blipFill>
+                    <a:blip r:embed="rId97"/>
+                    <a:stretch>
+                      <a:fillRect/>
+                    </a:stretch>
+                  </pic:blipFill>
+                  <pic:spPr bwMode="auto">
+                    <a:xfrm>
+                      <a:off x="0" y="0"/>
+                      <a:ext cx="5334000" cy="7490732"/>
+                    </a:xfrm>
+                    <a:prstGeom prst="rect">
+                      <a:avLst/>
+                    </a:prstGeom>
+                    <a:noFill/>
+                    <a:ln w="9525">
+                      <a:noFill/>
+                      <a:headEnd/>
+                      <a:tailEnd/>
+                    </a:ln>
+                  </pic:spPr>
+                </pic:pic>
+              </a:graphicData>
+            </a:graphic>
+          </wp:inline>
+        </w:drawing>
+      </w:r>
+    </w:p>
+    <w:bookmarkEnd w:id="100"/>
+    <w:bookmarkStart w:id="104" w:name="ssd-04-cambiar-estado-expediente"/>
+    <w:p>
+      <w:pPr>
+        <w:pStyle w:val="Heading3"/>
+      </w:pPr>
+      <w:r>
+        <w:t xml:space="preserve">SSD-04: Cambiar Estado Expediente</w:t>
+      </w:r>
+    </w:p>
+    <w:p>
+      <w:pPr>
+        <w:pStyle w:val="FirstParagraph"/>
+      </w:pPr>
+      <w:r>
+        <w:drawing>
+          <wp:inline>
+            <wp:extent cx="5334000" cy="12266839"/>
+            <wp:effectExtent b="0" l="0" r="0" t="0"/>
+            <wp:docPr descr="" title="" id="102" name="Picture"/>
+            <a:graphic>
+              <a:graphicData uri="http://schemas.openxmlformats.org/drawingml/2006/picture">
+                <pic:pic>
+                  <pic:nvPicPr>
+                    <pic:cNvPr descr="img/SSD-CU04.png" id="103" name="Picture"/>
+                    <pic:cNvPicPr>
+                      <a:picLocks noChangeArrowheads="1" noChangeAspect="1"/>
+                    </pic:cNvPicPr>
+                  </pic:nvPicPr>
+                  <pic:blipFill>
+                    <a:blip r:embed="rId101"/>
                     <a:stretch>
                       <a:fillRect/>
                     </a:stretch>
@@ -4341,22 +4569,14 @@
         </w:drawing>
       </w:r>
     </w:p>
-    <w:p>
-      <w:r>
-        <w:pict>
-          <v:rect style="width:0;height:1.5pt" o:hralign="center" o:hrstd="t" o:hr="t"/>
-        </w:pict>
-      </w:r>
-    </w:p>
-    <w:bookmarkEnd w:id="88"/>
-    <w:bookmarkEnd w:id="89"/>
-    <w:bookmarkStart w:id="93" w:name="flujo-de-estados-del-expediente"/>
-    <w:p>
-      <w:pPr>
-        <w:pStyle w:val="Heading2"/>
-      </w:pPr>
-      <w:r>
-        <w:t xml:space="preserve">Flujo de Estados del Expediente</w:t>
+    <w:bookmarkEnd w:id="104"/>
+    <w:bookmarkStart w:id="108" w:name="ssd-05-adjuntar-documento"/>
+    <w:p>
+      <w:pPr>
+        <w:pStyle w:val="Heading3"/>
+      </w:pPr>
+      <w:r>
+        <w:t xml:space="preserve">SSD-05: Adjuntar Documento</w:t>
       </w:r>
     </w:p>
     <w:p>
@@ -4366,20 +4586,598 @@
       <w:r>
         <w:drawing>
           <wp:inline>
-            <wp:extent cx="5334000" cy="5634098"/>
+            <wp:extent cx="5334000" cy="5571867"/>
             <wp:effectExtent b="0" l="0" r="0" t="0"/>
-            <wp:docPr descr="" title="" id="91" name="Picture"/>
+            <wp:docPr descr="" title="" id="106" name="Picture"/>
             <a:graphic>
               <a:graphicData uri="http://schemas.openxmlformats.org/drawingml/2006/picture">
                 <pic:pic>
                   <pic:nvPicPr>
-                    <pic:cNvPr descr="img/FLUJO_ESTADOS.png" id="92" name="Picture"/>
+                    <pic:cNvPr descr="img/SSD-CU05.png" id="107" name="Picture"/>
                     <pic:cNvPicPr>
                       <a:picLocks noChangeArrowheads="1" noChangeAspect="1"/>
                     </pic:cNvPicPr>
                   </pic:nvPicPr>
                   <pic:blipFill>
-                    <a:blip r:embed="rId90"/>
+                    <a:blip r:embed="rId105"/>
+                    <a:stretch>
+                      <a:fillRect/>
+                    </a:stretch>
+                  </pic:blipFill>
+                  <pic:spPr bwMode="auto">
+                    <a:xfrm>
+                      <a:off x="0" y="0"/>
+                      <a:ext cx="5334000" cy="5571867"/>
+                    </a:xfrm>
+                    <a:prstGeom prst="rect">
+                      <a:avLst/>
+                    </a:prstGeom>
+                    <a:noFill/>
+                    <a:ln w="9525">
+                      <a:noFill/>
+                      <a:headEnd/>
+                      <a:tailEnd/>
+                    </a:ln>
+                  </pic:spPr>
+                </pic:pic>
+              </a:graphicData>
+            </a:graphic>
+          </wp:inline>
+        </w:drawing>
+      </w:r>
+    </w:p>
+    <w:bookmarkEnd w:id="108"/>
+    <w:bookmarkStart w:id="112" w:name="ssd-06-gestionar-techo-presupuestal"/>
+    <w:p>
+      <w:pPr>
+        <w:pStyle w:val="Heading3"/>
+      </w:pPr>
+      <w:r>
+        <w:t xml:space="preserve">SSD-06: Gestionar Techo Presupuestal</w:t>
+      </w:r>
+    </w:p>
+    <w:p>
+      <w:pPr>
+        <w:pStyle w:val="FirstParagraph"/>
+      </w:pPr>
+      <w:r>
+        <w:drawing>
+          <wp:inline>
+            <wp:extent cx="5334000" cy="5567450"/>
+            <wp:effectExtent b="0" l="0" r="0" t="0"/>
+            <wp:docPr descr="" title="" id="110" name="Picture"/>
+            <a:graphic>
+              <a:graphicData uri="http://schemas.openxmlformats.org/drawingml/2006/picture">
+                <pic:pic>
+                  <pic:nvPicPr>
+                    <pic:cNvPr descr="img/SSD-CU06.png" id="111" name="Picture"/>
+                    <pic:cNvPicPr>
+                      <a:picLocks noChangeArrowheads="1" noChangeAspect="1"/>
+                    </pic:cNvPicPr>
+                  </pic:nvPicPr>
+                  <pic:blipFill>
+                    <a:blip r:embed="rId109"/>
+                    <a:stretch>
+                      <a:fillRect/>
+                    </a:stretch>
+                  </pic:blipFill>
+                  <pic:spPr bwMode="auto">
+                    <a:xfrm>
+                      <a:off x="0" y="0"/>
+                      <a:ext cx="5334000" cy="5567450"/>
+                    </a:xfrm>
+                    <a:prstGeom prst="rect">
+                      <a:avLst/>
+                    </a:prstGeom>
+                    <a:noFill/>
+                    <a:ln w="9525">
+                      <a:noFill/>
+                      <a:headEnd/>
+                      <a:tailEnd/>
+                    </a:ln>
+                  </pic:spPr>
+                </pic:pic>
+              </a:graphicData>
+            </a:graphic>
+          </wp:inline>
+        </w:drawing>
+      </w:r>
+    </w:p>
+    <w:bookmarkEnd w:id="112"/>
+    <w:bookmarkStart w:id="116" w:name="ssd-07-gestionar-actividad-poi"/>
+    <w:p>
+      <w:pPr>
+        <w:pStyle w:val="Heading3"/>
+      </w:pPr>
+      <w:r>
+        <w:t xml:space="preserve">SSD-07: Gestionar Actividad POI</w:t>
+      </w:r>
+    </w:p>
+    <w:p>
+      <w:pPr>
+        <w:pStyle w:val="FirstParagraph"/>
+      </w:pPr>
+      <w:r>
+        <w:drawing>
+          <wp:inline>
+            <wp:extent cx="5334000" cy="3660321"/>
+            <wp:effectExtent b="0" l="0" r="0" t="0"/>
+            <wp:docPr descr="" title="" id="114" name="Picture"/>
+            <a:graphic>
+              <a:graphicData uri="http://schemas.openxmlformats.org/drawingml/2006/picture">
+                <pic:pic>
+                  <pic:nvPicPr>
+                    <pic:cNvPr descr="img/SSD-CU07.png" id="115" name="Picture"/>
+                    <pic:cNvPicPr>
+                      <a:picLocks noChangeArrowheads="1" noChangeAspect="1"/>
+                    </pic:cNvPicPr>
+                  </pic:nvPicPr>
+                  <pic:blipFill>
+                    <a:blip r:embed="rId113"/>
+                    <a:stretch>
+                      <a:fillRect/>
+                    </a:stretch>
+                  </pic:blipFill>
+                  <pic:spPr bwMode="auto">
+                    <a:xfrm>
+                      <a:off x="0" y="0"/>
+                      <a:ext cx="5334000" cy="3660321"/>
+                    </a:xfrm>
+                    <a:prstGeom prst="rect">
+                      <a:avLst/>
+                    </a:prstGeom>
+                    <a:noFill/>
+                    <a:ln w="9525">
+                      <a:noFill/>
+                      <a:headEnd/>
+                      <a:tailEnd/>
+                    </a:ln>
+                  </pic:spPr>
+                </pic:pic>
+              </a:graphicData>
+            </a:graphic>
+          </wp:inline>
+        </w:drawing>
+      </w:r>
+    </w:p>
+    <w:bookmarkEnd w:id="116"/>
+    <w:bookmarkStart w:id="120" w:name="ssd-08-gestionar-necesidad-pap"/>
+    <w:p>
+      <w:pPr>
+        <w:pStyle w:val="Heading3"/>
+      </w:pPr>
+      <w:r>
+        <w:t xml:space="preserve">SSD-08: Gestionar Necesidad PAP</w:t>
+      </w:r>
+    </w:p>
+    <w:p>
+      <w:pPr>
+        <w:pStyle w:val="FirstParagraph"/>
+      </w:pPr>
+      <w:r>
+        <w:drawing>
+          <wp:inline>
+            <wp:extent cx="5334000" cy="4095750"/>
+            <wp:effectExtent b="0" l="0" r="0" t="0"/>
+            <wp:docPr descr="" title="" id="118" name="Picture"/>
+            <a:graphic>
+              <a:graphicData uri="http://schemas.openxmlformats.org/drawingml/2006/picture">
+                <pic:pic>
+                  <pic:nvPicPr>
+                    <pic:cNvPr descr="img/SSD-CU08.png" id="119" name="Picture"/>
+                    <pic:cNvPicPr>
+                      <a:picLocks noChangeArrowheads="1" noChangeAspect="1"/>
+                    </pic:cNvPicPr>
+                  </pic:nvPicPr>
+                  <pic:blipFill>
+                    <a:blip r:embed="rId117"/>
+                    <a:stretch>
+                      <a:fillRect/>
+                    </a:stretch>
+                  </pic:blipFill>
+                  <pic:spPr bwMode="auto">
+                    <a:xfrm>
+                      <a:off x="0" y="0"/>
+                      <a:ext cx="5334000" cy="4095750"/>
+                    </a:xfrm>
+                    <a:prstGeom prst="rect">
+                      <a:avLst/>
+                    </a:prstGeom>
+                    <a:noFill/>
+                    <a:ln w="9525">
+                      <a:noFill/>
+                      <a:headEnd/>
+                      <a:tailEnd/>
+                    </a:ln>
+                  </pic:spPr>
+                </pic:pic>
+              </a:graphicData>
+            </a:graphic>
+          </wp:inline>
+        </w:drawing>
+      </w:r>
+    </w:p>
+    <w:bookmarkEnd w:id="120"/>
+    <w:bookmarkStart w:id="124" w:name="ssd-09-gestionar-nota-modificatoria"/>
+    <w:p>
+      <w:pPr>
+        <w:pStyle w:val="Heading3"/>
+      </w:pPr>
+      <w:r>
+        <w:t xml:space="preserve">SSD-09: Gestionar Nota Modificatoria</w:t>
+      </w:r>
+    </w:p>
+    <w:p>
+      <w:pPr>
+        <w:pStyle w:val="FirstParagraph"/>
+      </w:pPr>
+      <w:r>
+        <w:drawing>
+          <wp:inline>
+            <wp:extent cx="5334000" cy="5891892"/>
+            <wp:effectExtent b="0" l="0" r="0" t="0"/>
+            <wp:docPr descr="" title="" id="122" name="Picture"/>
+            <a:graphic>
+              <a:graphicData uri="http://schemas.openxmlformats.org/drawingml/2006/picture">
+                <pic:pic>
+                  <pic:nvPicPr>
+                    <pic:cNvPr descr="img/SSD-CU09.png" id="123" name="Picture"/>
+                    <pic:cNvPicPr>
+                      <a:picLocks noChangeArrowheads="1" noChangeAspect="1"/>
+                    </pic:cNvPicPr>
+                  </pic:nvPicPr>
+                  <pic:blipFill>
+                    <a:blip r:embed="rId121"/>
+                    <a:stretch>
+                      <a:fillRect/>
+                    </a:stretch>
+                  </pic:blipFill>
+                  <pic:spPr bwMode="auto">
+                    <a:xfrm>
+                      <a:off x="0" y="0"/>
+                      <a:ext cx="5334000" cy="5891892"/>
+                    </a:xfrm>
+                    <a:prstGeom prst="rect">
+                      <a:avLst/>
+                    </a:prstGeom>
+                    <a:noFill/>
+                    <a:ln w="9525">
+                      <a:noFill/>
+                      <a:headEnd/>
+                      <a:tailEnd/>
+                    </a:ln>
+                  </pic:spPr>
+                </pic:pic>
+              </a:graphicData>
+            </a:graphic>
+          </wp:inline>
+        </w:drawing>
+      </w:r>
+    </w:p>
+    <w:bookmarkEnd w:id="124"/>
+    <w:bookmarkStart w:id="128" w:name="ssd-10-ver-reportes"/>
+    <w:p>
+      <w:pPr>
+        <w:pStyle w:val="Heading3"/>
+      </w:pPr>
+      <w:r>
+        <w:t xml:space="preserve">SSD-10: Ver Reportes</w:t>
+      </w:r>
+    </w:p>
+    <w:p>
+      <w:pPr>
+        <w:pStyle w:val="FirstParagraph"/>
+      </w:pPr>
+      <w:r>
+        <w:drawing>
+          <wp:inline>
+            <wp:extent cx="5334000" cy="6337870"/>
+            <wp:effectExtent b="0" l="0" r="0" t="0"/>
+            <wp:docPr descr="" title="" id="126" name="Picture"/>
+            <a:graphic>
+              <a:graphicData uri="http://schemas.openxmlformats.org/drawingml/2006/picture">
+                <pic:pic>
+                  <pic:nvPicPr>
+                    <pic:cNvPr descr="img/SSD-CU10.png" id="127" name="Picture"/>
+                    <pic:cNvPicPr>
+                      <a:picLocks noChangeArrowheads="1" noChangeAspect="1"/>
+                    </pic:cNvPicPr>
+                  </pic:nvPicPr>
+                  <pic:blipFill>
+                    <a:blip r:embed="rId125"/>
+                    <a:stretch>
+                      <a:fillRect/>
+                    </a:stretch>
+                  </pic:blipFill>
+                  <pic:spPr bwMode="auto">
+                    <a:xfrm>
+                      <a:off x="0" y="0"/>
+                      <a:ext cx="5334000" cy="6337870"/>
+                    </a:xfrm>
+                    <a:prstGeom prst="rect">
+                      <a:avLst/>
+                    </a:prstGeom>
+                    <a:noFill/>
+                    <a:ln w="9525">
+                      <a:noFill/>
+                      <a:headEnd/>
+                      <a:tailEnd/>
+                    </a:ln>
+                  </pic:spPr>
+                </pic:pic>
+              </a:graphicData>
+            </a:graphic>
+          </wp:inline>
+        </w:drawing>
+      </w:r>
+    </w:p>
+    <w:bookmarkEnd w:id="128"/>
+    <w:bookmarkStart w:id="132" w:name="ssd-11-gestionar-usuarios"/>
+    <w:p>
+      <w:pPr>
+        <w:pStyle w:val="Heading3"/>
+      </w:pPr>
+      <w:r>
+        <w:t xml:space="preserve">SSD-11: Gestionar Usuarios</w:t>
+      </w:r>
+    </w:p>
+    <w:p>
+      <w:pPr>
+        <w:pStyle w:val="FirstParagraph"/>
+      </w:pPr>
+      <w:r>
+        <w:drawing>
+          <wp:inline>
+            <wp:extent cx="5334000" cy="5851071"/>
+            <wp:effectExtent b="0" l="0" r="0" t="0"/>
+            <wp:docPr descr="" title="" id="130" name="Picture"/>
+            <a:graphic>
+              <a:graphicData uri="http://schemas.openxmlformats.org/drawingml/2006/picture">
+                <pic:pic>
+                  <pic:nvPicPr>
+                    <pic:cNvPr descr="img/SSD-CU11.png" id="131" name="Picture"/>
+                    <pic:cNvPicPr>
+                      <a:picLocks noChangeArrowheads="1" noChangeAspect="1"/>
+                    </pic:cNvPicPr>
+                  </pic:nvPicPr>
+                  <pic:blipFill>
+                    <a:blip r:embed="rId129"/>
+                    <a:stretch>
+                      <a:fillRect/>
+                    </a:stretch>
+                  </pic:blipFill>
+                  <pic:spPr bwMode="auto">
+                    <a:xfrm>
+                      <a:off x="0" y="0"/>
+                      <a:ext cx="5334000" cy="5851071"/>
+                    </a:xfrm>
+                    <a:prstGeom prst="rect">
+                      <a:avLst/>
+                    </a:prstGeom>
+                    <a:noFill/>
+                    <a:ln w="9525">
+                      <a:noFill/>
+                      <a:headEnd/>
+                      <a:tailEnd/>
+                    </a:ln>
+                  </pic:spPr>
+                </pic:pic>
+              </a:graphicData>
+            </a:graphic>
+          </wp:inline>
+        </w:drawing>
+      </w:r>
+    </w:p>
+    <w:bookmarkEnd w:id="132"/>
+    <w:bookmarkStart w:id="136" w:name="ssd-12-gestionar-notificaciones"/>
+    <w:p>
+      <w:pPr>
+        <w:pStyle w:val="Heading3"/>
+      </w:pPr>
+      <w:r>
+        <w:t xml:space="preserve">SSD-12: Gestionar Notificaciones</w:t>
+      </w:r>
+    </w:p>
+    <w:p>
+      <w:pPr>
+        <w:pStyle w:val="FirstParagraph"/>
+      </w:pPr>
+      <w:r>
+        <w:drawing>
+          <wp:inline>
+            <wp:extent cx="5334000" cy="5521706"/>
+            <wp:effectExtent b="0" l="0" r="0" t="0"/>
+            <wp:docPr descr="" title="" id="134" name="Picture"/>
+            <a:graphic>
+              <a:graphicData uri="http://schemas.openxmlformats.org/drawingml/2006/picture">
+                <pic:pic>
+                  <pic:nvPicPr>
+                    <pic:cNvPr descr="img/SSD-CU12.png" id="135" name="Picture"/>
+                    <pic:cNvPicPr>
+                      <a:picLocks noChangeArrowheads="1" noChangeAspect="1"/>
+                    </pic:cNvPicPr>
+                  </pic:nvPicPr>
+                  <pic:blipFill>
+                    <a:blip r:embed="rId133"/>
+                    <a:stretch>
+                      <a:fillRect/>
+                    </a:stretch>
+                  </pic:blipFill>
+                  <pic:spPr bwMode="auto">
+                    <a:xfrm>
+                      <a:off x="0" y="0"/>
+                      <a:ext cx="5334000" cy="5521706"/>
+                    </a:xfrm>
+                    <a:prstGeom prst="rect">
+                      <a:avLst/>
+                    </a:prstGeom>
+                    <a:noFill/>
+                    <a:ln w="9525">
+                      <a:noFill/>
+                      <a:headEnd/>
+                      <a:tailEnd/>
+                    </a:ln>
+                  </pic:spPr>
+                </pic:pic>
+              </a:graphicData>
+            </a:graphic>
+          </wp:inline>
+        </w:drawing>
+      </w:r>
+    </w:p>
+    <w:bookmarkEnd w:id="136"/>
+    <w:bookmarkStart w:id="140" w:name="ssd-13-rastrear-expediente"/>
+    <w:p>
+      <w:pPr>
+        <w:pStyle w:val="Heading3"/>
+      </w:pPr>
+      <w:r>
+        <w:t xml:space="preserve">SSD-13: Rastrear Expediente</w:t>
+      </w:r>
+    </w:p>
+    <w:p>
+      <w:pPr>
+        <w:pStyle w:val="FirstParagraph"/>
+      </w:pPr>
+      <w:r>
+        <w:drawing>
+          <wp:inline>
+            <wp:extent cx="5334000" cy="5374821"/>
+            <wp:effectExtent b="0" l="0" r="0" t="0"/>
+            <wp:docPr descr="" title="" id="138" name="Picture"/>
+            <a:graphic>
+              <a:graphicData uri="http://schemas.openxmlformats.org/drawingml/2006/picture">
+                <pic:pic>
+                  <pic:nvPicPr>
+                    <pic:cNvPr descr="img/SSD-CU13.png" id="139" name="Picture"/>
+                    <pic:cNvPicPr>
+                      <a:picLocks noChangeArrowheads="1" noChangeAspect="1"/>
+                    </pic:cNvPicPr>
+                  </pic:nvPicPr>
+                  <pic:blipFill>
+                    <a:blip r:embed="rId137"/>
+                    <a:stretch>
+                      <a:fillRect/>
+                    </a:stretch>
+                  </pic:blipFill>
+                  <pic:spPr bwMode="auto">
+                    <a:xfrm>
+                      <a:off x="0" y="0"/>
+                      <a:ext cx="5334000" cy="5374821"/>
+                    </a:xfrm>
+                    <a:prstGeom prst="rect">
+                      <a:avLst/>
+                    </a:prstGeom>
+                    <a:noFill/>
+                    <a:ln w="9525">
+                      <a:noFill/>
+                      <a:headEnd/>
+                      <a:tailEnd/>
+                    </a:ln>
+                  </pic:spPr>
+                </pic:pic>
+              </a:graphicData>
+            </a:graphic>
+          </wp:inline>
+        </w:drawing>
+      </w:r>
+    </w:p>
+    <w:bookmarkEnd w:id="140"/>
+    <w:bookmarkStart w:id="144" w:name="ssd-14-cerrar-sesion"/>
+    <w:p>
+      <w:pPr>
+        <w:pStyle w:val="Heading3"/>
+      </w:pPr>
+      <w:r>
+        <w:t xml:space="preserve">SSD-14: Cerrar Sesion</w:t>
+      </w:r>
+    </w:p>
+    <w:p>
+      <w:pPr>
+        <w:pStyle w:val="FirstParagraph"/>
+      </w:pPr>
+      <w:r>
+        <w:drawing>
+          <wp:inline>
+            <wp:extent cx="5334000" cy="5523078"/>
+            <wp:effectExtent b="0" l="0" r="0" t="0"/>
+            <wp:docPr descr="" title="" id="142" name="Picture"/>
+            <a:graphic>
+              <a:graphicData uri="http://schemas.openxmlformats.org/drawingml/2006/picture">
+                <pic:pic>
+                  <pic:nvPicPr>
+                    <pic:cNvPr descr="img/SSD-CU14.png" id="143" name="Picture"/>
+                    <pic:cNvPicPr>
+                      <a:picLocks noChangeArrowheads="1" noChangeAspect="1"/>
+                    </pic:cNvPicPr>
+                  </pic:nvPicPr>
+                  <pic:blipFill>
+                    <a:blip r:embed="rId141"/>
+                    <a:stretch>
+                      <a:fillRect/>
+                    </a:stretch>
+                  </pic:blipFill>
+                  <pic:spPr bwMode="auto">
+                    <a:xfrm>
+                      <a:off x="0" y="0"/>
+                      <a:ext cx="5334000" cy="5523078"/>
+                    </a:xfrm>
+                    <a:prstGeom prst="rect">
+                      <a:avLst/>
+                    </a:prstGeom>
+                    <a:noFill/>
+                    <a:ln w="9525">
+                      <a:noFill/>
+                      <a:headEnd/>
+                      <a:tailEnd/>
+                    </a:ln>
+                  </pic:spPr>
+                </pic:pic>
+              </a:graphicData>
+            </a:graphic>
+          </wp:inline>
+        </w:drawing>
+      </w:r>
+    </w:p>
+    <w:p>
+      <w:r>
+        <w:pict>
+          <v:rect style="width:0;height:1.5pt" o:hralign="center" o:hrstd="t" o:hr="t"/>
+        </w:pict>
+      </w:r>
+    </w:p>
+    <w:bookmarkEnd w:id="144"/>
+    <w:bookmarkEnd w:id="145"/>
+    <w:bookmarkStart w:id="149" w:name="flujo-de-estados-del-expediente"/>
+    <w:p>
+      <w:pPr>
+        <w:pStyle w:val="Heading2"/>
+      </w:pPr>
+      <w:r>
+        <w:t xml:space="preserve">Flujo de Estados del Expediente</w:t>
+      </w:r>
+    </w:p>
+    <w:p>
+      <w:pPr>
+        <w:pStyle w:val="FirstParagraph"/>
+      </w:pPr>
+      <w:r>
+        <w:drawing>
+          <wp:inline>
+            <wp:extent cx="5334000" cy="5634098"/>
+            <wp:effectExtent b="0" l="0" r="0" t="0"/>
+            <wp:docPr descr="" title="" id="147" name="Picture"/>
+            <a:graphic>
+              <a:graphicData uri="http://schemas.openxmlformats.org/drawingml/2006/picture">
+                <pic:pic>
+                  <pic:nvPicPr>
+                    <pic:cNvPr descr="img/FLUJO_ESTADOS.png" id="148" name="Picture"/>
+                    <pic:cNvPicPr>
+                      <a:picLocks noChangeArrowheads="1" noChangeAspect="1"/>
+                    </pic:cNvPicPr>
+                  </pic:nvPicPr>
+                  <pic:blipFill>
+                    <a:blip r:embed="rId146"/>
                     <a:stretch>
                       <a:fillRect/>
                     </a:stretch>
@@ -4579,9 +5377,9 @@
         </w:pict>
       </w:r>
     </w:p>
-    <w:bookmarkEnd w:id="93"/>
-    <w:bookmarkEnd w:id="94"/>
-    <w:bookmarkStart w:id="98" w:name="guia-de-uso"/>
+    <w:bookmarkEnd w:id="149"/>
+    <w:bookmarkEnd w:id="150"/>
+    <w:bookmarkStart w:id="154" w:name="guia-de-uso"/>
     <w:p>
       <w:pPr>
         <w:pStyle w:val="Heading1"/>
@@ -4590,7 +5388,7 @@
         <w:t xml:space="preserve">3. GUIA DE USO</w:t>
       </w:r>
     </w:p>
-    <w:bookmarkStart w:id="95" w:name="roles-y-permisos"/>
+    <w:bookmarkStart w:id="151" w:name="roles-y-permisos"/>
     <w:p>
       <w:pPr>
         <w:pStyle w:val="Heading2"/>
@@ -4782,8 +5580,8 @@
         </w:tc>
       </w:tr>
     </w:tbl>
-    <w:bookmarkEnd w:id="95"/>
-    <w:bookmarkStart w:id="96" w:name="credenciales"/>
+    <w:bookmarkEnd w:id="151"/>
+    <w:bookmarkStart w:id="152" w:name="credenciales"/>
     <w:p>
       <w:pPr>
         <w:pStyle w:val="Heading2"/>
@@ -5052,8 +5850,8 @@
         </w:tc>
       </w:tr>
     </w:tbl>
-    <w:bookmarkEnd w:id="96"/>
-    <w:bookmarkStart w:id="97" w:name="flujo-de-trabajo"/>
+    <w:bookmarkEnd w:id="152"/>
+    <w:bookmarkStart w:id="153" w:name="flujo-de-trabajo"/>
     <w:p>
       <w:pPr>
         <w:pStyle w:val="Heading2"/>
@@ -5223,9 +6021,9 @@
         </w:pict>
       </w:r>
     </w:p>
-    <w:bookmarkEnd w:id="97"/>
-    <w:bookmarkEnd w:id="98"/>
-    <w:bookmarkStart w:id="99" w:name="datos-de-prueba"/>
+    <w:bookmarkEnd w:id="153"/>
+    <w:bookmarkEnd w:id="154"/>
+    <w:bookmarkStart w:id="155" w:name="datos-de-prueba"/>
     <w:p>
       <w:pPr>
         <w:pStyle w:val="Heading1"/>
@@ -5399,8 +6197,8 @@
         </w:pict>
       </w:r>
     </w:p>
-    <w:bookmarkEnd w:id="99"/>
-    <w:bookmarkStart w:id="100" w:name="lecciones-aprendidas"/>
+    <w:bookmarkEnd w:id="155"/>
+    <w:bookmarkStart w:id="156" w:name="lecciones-aprendidas"/>
     <w:p>
       <w:pPr>
         <w:pStyle w:val="Heading1"/>
@@ -6050,10 +6848,10 @@
           <w:b/>
           <w:bCs/>
         </w:rPr>
-        <w:t xml:space="preserve">Fin del informe. 18 diagramas generados como imagenes PNG.</w:t>
-      </w:r>
-    </w:p>
-    <w:bookmarkEnd w:id="100"/>
+        <w:t xml:space="preserve">Fin del informe. 32 diagramas generados como imagenes PNG.</w:t>
+      </w:r>
+    </w:p>
+    <w:bookmarkEnd w:id="156"/>
     <w:sectPr>
       <w:footnotePr>
         <w:numRestart w:val="eachSect"/>

</xml_diff>